<commit_message>
feat(cv): sync site to post-overhaul canonical CV (116 credentials, corrected chronology)
- Serve undated canonical /cv/Sami_Halawa_CV.pdf (8pp, 2026-08-18 master), regenerated ATS txt and preview
- Update credential counts 114 -> 116 and preview caption
- Remove stale role-variant resume fleet section (single-canonical-CV policy)
- Align Experience chronology with corrected LinkedIn truth (Founding AI Engineer & Systems Architect, ML/LLMOps, AutoClient, advisor roles) in EN/ES/FR/ZH

Co-Authored-By: Claude Fable 5 <noreply@anthropic.com>
</commit_message>
<xml_diff>
--- a/output/docx/Sami_Halawa_GCP_AI_Engineer_Focused_CV.docx
+++ b/output/docx/Sami_Halawa_GCP_AI_Engineer_Focused_CV.docx
@@ -1218,7 +1218,7 @@
           <w:color w:val="1B232D"/>
           <w:sz w:val="18"/>
         </w:rPr>
-        <w:t xml:space="preserve">End-to-end ML engineering scope. </w:t>
+        <w:t xml:space="preserve">Google Cloud Professional Machine Learning Engineer exam-blueprint alignment (certification not claimed). </w:t>
       </w:r>
       <w:r>
         <w:rPr>
@@ -1228,7 +1228,7 @@
           <w:color w:val="1B232D"/>
           <w:sz w:val="18"/>
         </w:rPr>
-        <w:t>Designs low-code and coded AI solutions, manages data and models, scales prototypes, serves models, automates ML pipelines and monitors production AI across Vertex AI, BigQuery, GKE, Cloud Run, AlloyDB and Cloud Build.</w:t>
+        <w:t>Hands-on architecture maps to all six exam domains: architecting low-code AI solutions; managing data and models across teams; scaling prototypes; serving and scaling models; automating ML pipelines; and monitoring AI solutions across Vertex AI, BigQuery, GKE, Cloud Run, AlloyDB and Cloud Build.</w:t>
       </w:r>
     </w:p>
     <w:p>

</xml_diff>